<commit_message>
Actualizar plantillas Avanade/Ricoh y permisos locales de Claude
- Avanade.docx y Ricoh.docx: ediciones manuales del template
- Avanade.docx.bak: backup de la versión anterior
- .claude/settings.local.json: permisos añadidos durante sesiones recientes

Co-Authored-By: Claude Opus 4.7 (1M context) <noreply@anthropic.com>
</commit_message>
<xml_diff>
--- a/templates/Avanade.docx
+++ b/templates/Avanade.docx
@@ -3529,6 +3529,23 @@
       </w:rPr>
     </w:lvl>
   </w:abstractNum>
+  <w:abstractNum w:abstractNumId="2" w15:restartNumberingAfterBreak="0">
+    <w:nsid w:val="1A2B3C4D"/>
+    <w:multiLevelType w:val="hybridMultilevel"/>
+    <w:tmpl w:val="1A2B3C4D"/>
+    <w:lvl w:ilvl="0" w:tplc="0C0A0001">
+      <w:start w:val="1"/>
+      <w:numFmt w:val="bullet"/>
+      <w:lvlText w:val=""/>
+      <w:lvlJc w:val="left"/>
+      <w:pPr>
+        <w:ind w:left="720" w:hanging="360"/>
+      </w:pPr>
+      <w:rPr>
+        <w:rFonts w:ascii="Symbol" w:hAnsi="Symbol" w:hint="default"/>
+      </w:rPr>
+    </w:lvl>
+  </w:abstractNum>
   <w:num w:numId="1" w16cid:durableId="1848860253">
     <w:abstractNumId w:val="0"/>
     <w:lvlOverride w:ilvl="0">
@@ -3783,6 +3800,9 @@
   </w:num>
   <w:num w:numId="19" w16cid:durableId="1980843321">
     <w:abstractNumId w:val="1"/>
+  </w:num>
+  <w:num w:numId="20">
+    <w:abstractNumId w:val="2"/>
   </w:num>
 </w:numbering>
 </file>

</xml_diff>